<commit_message>
Document the empty-dropdown failure and how to diagnose it
Co-authored-by: paladuguraj <paladuguraj@users.noreply.github.com>
</commit_message>
<xml_diff>
--- a/docs/CSAT Survey Portal - Migration Runbook.docx
+++ b/docs/CSAT Survey Portal - Migration Runbook.docx
@@ -28,7 +28,7 @@
         </w:p>
       </w:sdtContent>
     </w:sdt>
-    <w:bookmarkStart w:id="35" w:name="X47d3ed5a99bd92b08e0bc22d12ab79240fbfc78"/>
+    <w:bookmarkStart w:id="36" w:name="X47d3ed5a99bd92b08e0bc22d12ab79240fbfc78"/>
     <w:p>
       <w:pPr>
         <w:pStyle w:val="Heading1"/>
@@ -1481,7 +1481,7 @@
       </w:r>
     </w:p>
     <w:bookmarkEnd w:id="27"/>
-    <w:bookmarkStart w:id="34" w:name="the-update-set-to-move"/>
+    <w:bookmarkStart w:id="35" w:name="the-update-set-to-move"/>
     <w:p>
       <w:pPr>
         <w:pStyle w:val="Heading2"/>
@@ -2431,7 +2431,157 @@
       </w:r>
     </w:p>
     <w:bookmarkEnd w:id="31"/>
-    <w:bookmarkStart w:id="32" w:name="rebuilding-the-consolidated-set"/>
+    <w:bookmarkStart w:id="32" w:name="X9bae45b610be8731ba1d1b5a214071cee6018c3"/>
+    <w:p>
+      <w:pPr>
+        <w:pStyle w:val="Heading3"/>
+      </w:pPr>
+      <w:r>
+        <w:t xml:space="preserve">If the survey dropdown is empty after a commit</w:t>
+      </w:r>
+    </w:p>
+    <w:p>
+      <w:pPr>
+        <w:pStyle w:val="FirstParagraph"/>
+      </w:pPr>
+      <w:r>
+        <w:t xml:space="preserve">The portal decides which surveys to offer by matching survey</w:t>
+      </w:r>
+      <w:r>
+        <w:t xml:space="preserve"> </w:t>
+      </w:r>
+      <w:r>
+        <w:rPr>
+          <w:bCs/>
+          <w:b/>
+        </w:rPr>
+        <w:t xml:space="preserve">names</w:t>
+      </w:r>
+      <w:r>
+        <w:t xml:space="preserve"> </w:t>
+      </w:r>
+      <w:r>
+        <w:t xml:space="preserve">against</w:t>
+      </w:r>
+      <w:r>
+        <w:t xml:space="preserve"> </w:t>
+      </w:r>
+      <w:r>
+        <w:t xml:space="preserve">the</w:t>
+      </w:r>
+      <w:r>
+        <w:t xml:space="preserve"> </w:t>
+      </w:r>
+      <w:r>
+        <w:rPr>
+          <w:rStyle w:val="VerbatimChar"/>
+        </w:rPr>
+        <w:t xml:space="preserve">csat.portal.survey_names</w:t>
+      </w:r>
+      <w:r>
+        <w:t xml:space="preserve"> </w:t>
+      </w:r>
+      <w:r>
+        <w:t xml:space="preserve">property. If the property arrives on an instance</w:t>
+      </w:r>
+      <w:r>
+        <w:t xml:space="preserve"> </w:t>
+      </w:r>
+      <w:r>
+        <w:t xml:space="preserve">but the survey definitions do not — because they were skipped on preview, or</w:t>
+      </w:r>
+      <w:r>
+        <w:t xml:space="preserve"> </w:t>
+      </w:r>
+      <w:r>
+        <w:t xml:space="preserve">already existed there under different names — nothing matches.</w:t>
+      </w:r>
+    </w:p>
+    <w:p>
+      <w:pPr>
+        <w:pStyle w:val="BodyText"/>
+      </w:pPr>
+      <w:r>
+        <w:t xml:space="preserve">Run the diagnostic against the instance:</w:t>
+      </w:r>
+    </w:p>
+    <w:p>
+      <w:pPr>
+        <w:pStyle w:val="SourceCode"/>
+      </w:pPr>
+      <w:r>
+        <w:rPr>
+          <w:rStyle w:val="VariableTok"/>
+        </w:rPr>
+        <w:t xml:space="preserve">ENV_FILE</w:t>
+      </w:r>
+      <w:r>
+        <w:rPr>
+          <w:rStyle w:val="OperatorTok"/>
+        </w:rPr>
+        <w:t xml:space="preserve">=</w:t>
+      </w:r>
+      <w:r>
+        <w:rPr>
+          <w:rStyle w:val="NormalTok"/>
+        </w:rPr>
+        <w:t xml:space="preserve">.env.target </w:t>
+      </w:r>
+      <w:r>
+        <w:rPr>
+          <w:rStyle w:val="ExtensionTok"/>
+        </w:rPr>
+        <w:t xml:space="preserve">node</w:t>
+      </w:r>
+      <w:r>
+        <w:rPr>
+          <w:rStyle w:val="NormalTok"/>
+        </w:rPr>
+        <w:t xml:space="preserve"> scripts/diagnose-csat.js</w:t>
+      </w:r>
+    </w:p>
+    <w:p>
+      <w:pPr>
+        <w:pStyle w:val="FirstParagraph"/>
+      </w:pPr>
+      <w:r>
+        <w:t xml:space="preserve">It reports which configured names are missing and lists the surveys actually</w:t>
+      </w:r>
+      <w:r>
+        <w:t xml:space="preserve"> </w:t>
+      </w:r>
+      <w:r>
+        <w:t xml:space="preserve">present, so the fix is either to rename the surveys or to point the property at</w:t>
+      </w:r>
+      <w:r>
+        <w:t xml:space="preserve"> </w:t>
+      </w:r>
+      <w:r>
+        <w:t xml:space="preserve">the names that are there.</w:t>
+      </w:r>
+    </w:p>
+    <w:p>
+      <w:pPr>
+        <w:pStyle w:val="BodyText"/>
+      </w:pPr>
+      <w:r>
+        <w:t xml:space="preserve">The form no longer goes blank in this situation: an allow-list matching nothing</w:t>
+      </w:r>
+      <w:r>
+        <w:t xml:space="preserve"> </w:t>
+      </w:r>
+      <w:r>
+        <w:t xml:space="preserve">falls back to offering every active survey and shows a warning explaining why.</w:t>
+      </w:r>
+      <w:r>
+        <w:t xml:space="preserve"> </w:t>
+      </w:r>
+      <w:r>
+        <w:t xml:space="preserve">Offering too many is wrong but visible; offering none just looks broken.</w:t>
+      </w:r>
+    </w:p>
+    <w:bookmarkEnd w:id="32"/>
+    <w:bookmarkStart w:id="33" w:name="rebuilding-the-consolidated-set"/>
     <w:p>
       <w:pPr>
         <w:pStyle w:val="Heading3"/>
@@ -2894,8 +3044,8 @@
         <w:t xml:space="preserve">target.</w:t>
       </w:r>
     </w:p>
-    <w:bookmarkEnd w:id="32"/>
-    <w:bookmarkStart w:id="33" w:name="why-consolidation-was-needed"/>
+    <w:bookmarkEnd w:id="33"/>
+    <w:bookmarkStart w:id="34" w:name="why-consolidation-was-needed"/>
     <w:p>
       <w:pPr>
         <w:pStyle w:val="Heading3"/>
@@ -2994,9 +3144,9 @@
         <w:t xml:space="preserve">so migrating the named sets alone would have shipped older core logic.</w:t>
       </w:r>
     </w:p>
-    <w:bookmarkEnd w:id="33"/>
     <w:bookmarkEnd w:id="34"/>
     <w:bookmarkEnd w:id="35"/>
+    <w:bookmarkEnd w:id="36"/>
     <w:sectPr/>
   </w:body>
 </w:document>

</xml_diff>